<commit_message>
Implemented test database and created pytests for the API
</commit_message>
<xml_diff>
--- a/MarketLens_Project_Requirements_and_Implementation_Plan_v1.1.docx
+++ b/MarketLens_Project_Requirements_and_Implementation_Plan_v1.1.docx
@@ -360,6 +360,7 @@
             <w:pPr>
               <w:pStyle w:val="Normal"/>
               <w:widowControl/>
+              <w:suppressAutoHyphens w:val="true"/>
               <w:spacing w:lineRule="auto" w:line="240" w:before="0" w:after="0"/>
               <w:jc w:val="left"/>
               <w:rPr>
@@ -392,6 +393,7 @@
             <w:pPr>
               <w:pStyle w:val="Normal"/>
               <w:widowControl/>
+              <w:suppressAutoHyphens w:val="true"/>
               <w:spacing w:lineRule="auto" w:line="240" w:before="0" w:after="0"/>
               <w:jc w:val="left"/>
               <w:rPr>
@@ -424,6 +426,7 @@
             <w:pPr>
               <w:pStyle w:val="Normal"/>
               <w:widowControl/>
+              <w:suppressAutoHyphens w:val="true"/>
               <w:spacing w:lineRule="auto" w:line="240" w:before="0" w:after="0"/>
               <w:jc w:val="left"/>
               <w:rPr>
@@ -458,6 +461,7 @@
             <w:pPr>
               <w:pStyle w:val="Normal"/>
               <w:widowControl/>
+              <w:suppressAutoHyphens w:val="true"/>
               <w:spacing w:lineRule="auto" w:line="240" w:before="0" w:after="0"/>
               <w:jc w:val="left"/>
               <w:rPr>
@@ -488,6 +492,7 @@
             <w:pPr>
               <w:pStyle w:val="Normal"/>
               <w:widowControl/>
+              <w:suppressAutoHyphens w:val="true"/>
               <w:spacing w:lineRule="auto" w:line="240" w:before="0" w:after="0"/>
               <w:jc w:val="left"/>
               <w:rPr>
@@ -518,6 +523,7 @@
             <w:pPr>
               <w:pStyle w:val="Normal"/>
               <w:widowControl/>
+              <w:suppressAutoHyphens w:val="true"/>
               <w:spacing w:lineRule="auto" w:line="240" w:before="0" w:after="0"/>
               <w:jc w:val="left"/>
               <w:rPr>
@@ -551,6 +557,7 @@
             <w:pPr>
               <w:pStyle w:val="Normal"/>
               <w:widowControl/>
+              <w:suppressAutoHyphens w:val="true"/>
               <w:spacing w:lineRule="auto" w:line="240" w:before="0" w:after="0"/>
               <w:jc w:val="left"/>
               <w:rPr>
@@ -581,6 +588,7 @@
             <w:pPr>
               <w:pStyle w:val="Normal"/>
               <w:widowControl/>
+              <w:suppressAutoHyphens w:val="true"/>
               <w:spacing w:lineRule="auto" w:line="240" w:before="0" w:after="0"/>
               <w:jc w:val="left"/>
               <w:rPr>
@@ -611,6 +619,7 @@
             <w:pPr>
               <w:pStyle w:val="Normal"/>
               <w:widowControl/>
+              <w:suppressAutoHyphens w:val="true"/>
               <w:spacing w:lineRule="auto" w:line="240" w:before="0" w:after="0"/>
               <w:jc w:val="left"/>
               <w:rPr>
@@ -644,6 +653,7 @@
             <w:pPr>
               <w:pStyle w:val="Normal"/>
               <w:widowControl/>
+              <w:suppressAutoHyphens w:val="true"/>
               <w:spacing w:lineRule="auto" w:line="240" w:before="0" w:after="0"/>
               <w:jc w:val="left"/>
               <w:rPr>
@@ -674,6 +684,7 @@
             <w:pPr>
               <w:pStyle w:val="Normal"/>
               <w:widowControl/>
+              <w:suppressAutoHyphens w:val="true"/>
               <w:spacing w:lineRule="auto" w:line="240" w:before="0" w:after="0"/>
               <w:jc w:val="left"/>
               <w:rPr>
@@ -704,6 +715,7 @@
             <w:pPr>
               <w:pStyle w:val="Normal"/>
               <w:widowControl/>
+              <w:suppressAutoHyphens w:val="true"/>
               <w:spacing w:lineRule="auto" w:line="240" w:before="0" w:after="0"/>
               <w:jc w:val="left"/>
               <w:rPr>
@@ -737,6 +749,7 @@
             <w:pPr>
               <w:pStyle w:val="Normal"/>
               <w:widowControl/>
+              <w:suppressAutoHyphens w:val="true"/>
               <w:spacing w:lineRule="auto" w:line="240" w:before="0" w:after="0"/>
               <w:jc w:val="left"/>
               <w:rPr>
@@ -767,6 +780,7 @@
             <w:pPr>
               <w:pStyle w:val="Normal"/>
               <w:widowControl/>
+              <w:suppressAutoHyphens w:val="true"/>
               <w:spacing w:lineRule="auto" w:line="240" w:before="0" w:after="0"/>
               <w:jc w:val="left"/>
               <w:rPr>
@@ -797,6 +811,7 @@
             <w:pPr>
               <w:pStyle w:val="Normal"/>
               <w:widowControl/>
+              <w:suppressAutoHyphens w:val="true"/>
               <w:spacing w:lineRule="auto" w:line="240" w:before="0" w:after="0"/>
               <w:jc w:val="left"/>
               <w:rPr>
@@ -830,6 +845,7 @@
             <w:pPr>
               <w:pStyle w:val="Normal"/>
               <w:widowControl/>
+              <w:suppressAutoHyphens w:val="true"/>
               <w:spacing w:lineRule="auto" w:line="240" w:before="0" w:after="0"/>
               <w:jc w:val="left"/>
               <w:rPr>
@@ -860,6 +876,7 @@
             <w:pPr>
               <w:pStyle w:val="Normal"/>
               <w:widowControl/>
+              <w:suppressAutoHyphens w:val="true"/>
               <w:spacing w:lineRule="auto" w:line="240" w:before="0" w:after="0"/>
               <w:jc w:val="left"/>
               <w:rPr>
@@ -890,6 +907,7 @@
             <w:pPr>
               <w:pStyle w:val="Normal"/>
               <w:widowControl/>
+              <w:suppressAutoHyphens w:val="true"/>
               <w:spacing w:lineRule="auto" w:line="240" w:before="0" w:after="0"/>
               <w:jc w:val="left"/>
               <w:rPr>
@@ -923,6 +941,7 @@
             <w:pPr>
               <w:pStyle w:val="Normal"/>
               <w:widowControl/>
+              <w:suppressAutoHyphens w:val="true"/>
               <w:spacing w:lineRule="auto" w:line="240" w:before="0" w:after="0"/>
               <w:jc w:val="left"/>
               <w:rPr>
@@ -953,6 +972,7 @@
             <w:pPr>
               <w:pStyle w:val="Normal"/>
               <w:widowControl/>
+              <w:suppressAutoHyphens w:val="true"/>
               <w:spacing w:lineRule="auto" w:line="240" w:before="0" w:after="0"/>
               <w:jc w:val="left"/>
               <w:rPr>
@@ -983,6 +1003,7 @@
             <w:pPr>
               <w:pStyle w:val="Normal"/>
               <w:widowControl/>
+              <w:suppressAutoHyphens w:val="true"/>
               <w:spacing w:lineRule="auto" w:line="240" w:before="0" w:after="0"/>
               <w:jc w:val="left"/>
               <w:rPr>
@@ -1016,6 +1037,7 @@
             <w:pPr>
               <w:pStyle w:val="Normal"/>
               <w:widowControl/>
+              <w:suppressAutoHyphens w:val="true"/>
               <w:spacing w:lineRule="auto" w:line="240" w:before="0" w:after="0"/>
               <w:jc w:val="left"/>
               <w:rPr>
@@ -1046,6 +1068,7 @@
             <w:pPr>
               <w:pStyle w:val="Normal"/>
               <w:widowControl/>
+              <w:suppressAutoHyphens w:val="true"/>
               <w:spacing w:lineRule="auto" w:line="240" w:before="0" w:after="0"/>
               <w:jc w:val="left"/>
               <w:rPr>
@@ -1076,6 +1099,7 @@
             <w:pPr>
               <w:pStyle w:val="Normal"/>
               <w:widowControl/>
+              <w:suppressAutoHyphens w:val="true"/>
               <w:spacing w:lineRule="auto" w:line="240" w:before="0" w:after="0"/>
               <w:jc w:val="left"/>
               <w:rPr>
@@ -1109,6 +1133,7 @@
             <w:pPr>
               <w:pStyle w:val="Normal"/>
               <w:widowControl/>
+              <w:suppressAutoHyphens w:val="true"/>
               <w:spacing w:lineRule="auto" w:line="240" w:before="0" w:after="0"/>
               <w:jc w:val="left"/>
               <w:rPr>
@@ -1139,6 +1164,7 @@
             <w:pPr>
               <w:pStyle w:val="Normal"/>
               <w:widowControl/>
+              <w:suppressAutoHyphens w:val="true"/>
               <w:spacing w:lineRule="auto" w:line="240" w:before="0" w:after="0"/>
               <w:jc w:val="left"/>
               <w:rPr>
@@ -1169,6 +1195,7 @@
             <w:pPr>
               <w:pStyle w:val="Normal"/>
               <w:widowControl/>
+              <w:suppressAutoHyphens w:val="true"/>
               <w:spacing w:lineRule="auto" w:line="240" w:before="0" w:after="0"/>
               <w:jc w:val="left"/>
               <w:rPr>
@@ -1202,6 +1229,7 @@
             <w:pPr>
               <w:pStyle w:val="Normal"/>
               <w:widowControl/>
+              <w:suppressAutoHyphens w:val="true"/>
               <w:spacing w:lineRule="auto" w:line="240" w:before="0" w:after="0"/>
               <w:jc w:val="left"/>
               <w:rPr>
@@ -1232,6 +1260,7 @@
             <w:pPr>
               <w:pStyle w:val="Normal"/>
               <w:widowControl/>
+              <w:suppressAutoHyphens w:val="true"/>
               <w:spacing w:lineRule="auto" w:line="240" w:before="0" w:after="0"/>
               <w:jc w:val="left"/>
               <w:rPr>
@@ -1262,6 +1291,7 @@
             <w:pPr>
               <w:pStyle w:val="Normal"/>
               <w:widowControl/>
+              <w:suppressAutoHyphens w:val="true"/>
               <w:spacing w:lineRule="auto" w:line="240" w:before="0" w:after="0"/>
               <w:jc w:val="left"/>
               <w:rPr>
@@ -1295,6 +1325,7 @@
             <w:pPr>
               <w:pStyle w:val="Normal"/>
               <w:widowControl/>
+              <w:suppressAutoHyphens w:val="true"/>
               <w:spacing w:lineRule="auto" w:line="240" w:before="0" w:after="0"/>
               <w:jc w:val="left"/>
               <w:rPr>
@@ -1325,6 +1356,7 @@
             <w:pPr>
               <w:pStyle w:val="Normal"/>
               <w:widowControl/>
+              <w:suppressAutoHyphens w:val="true"/>
               <w:spacing w:lineRule="auto" w:line="240" w:before="0" w:after="0"/>
               <w:jc w:val="left"/>
               <w:rPr>
@@ -1355,6 +1387,7 @@
             <w:pPr>
               <w:pStyle w:val="Normal"/>
               <w:widowControl/>
+              <w:suppressAutoHyphens w:val="true"/>
               <w:spacing w:lineRule="auto" w:line="240" w:before="0" w:after="0"/>
               <w:jc w:val="left"/>
               <w:rPr>
@@ -1388,6 +1421,7 @@
             <w:pPr>
               <w:pStyle w:val="Normal"/>
               <w:widowControl/>
+              <w:suppressAutoHyphens w:val="true"/>
               <w:spacing w:lineRule="auto" w:line="240" w:before="0" w:after="0"/>
               <w:jc w:val="left"/>
               <w:rPr>
@@ -1418,6 +1452,7 @@
             <w:pPr>
               <w:pStyle w:val="Normal"/>
               <w:widowControl/>
+              <w:suppressAutoHyphens w:val="true"/>
               <w:spacing w:lineRule="auto" w:line="240" w:before="0" w:after="0"/>
               <w:jc w:val="left"/>
               <w:rPr>
@@ -1448,6 +1483,7 @@
             <w:pPr>
               <w:pStyle w:val="Normal"/>
               <w:widowControl/>
+              <w:suppressAutoHyphens w:val="true"/>
               <w:spacing w:lineRule="auto" w:line="240" w:before="0" w:after="0"/>
               <w:jc w:val="left"/>
               <w:rPr>
@@ -1481,6 +1517,7 @@
             <w:pPr>
               <w:pStyle w:val="Normal"/>
               <w:widowControl/>
+              <w:suppressAutoHyphens w:val="true"/>
               <w:spacing w:lineRule="auto" w:line="240" w:before="0" w:after="0"/>
               <w:jc w:val="left"/>
               <w:rPr>
@@ -1511,6 +1548,7 @@
             <w:pPr>
               <w:pStyle w:val="Normal"/>
               <w:widowControl/>
+              <w:suppressAutoHyphens w:val="true"/>
               <w:spacing w:lineRule="auto" w:line="240" w:before="0" w:after="0"/>
               <w:jc w:val="left"/>
               <w:rPr>
@@ -1541,6 +1579,7 @@
             <w:pPr>
               <w:pStyle w:val="Normal"/>
               <w:widowControl/>
+              <w:suppressAutoHyphens w:val="true"/>
               <w:spacing w:lineRule="auto" w:line="240" w:before="0" w:after="0"/>
               <w:jc w:val="left"/>
               <w:rPr>
@@ -1574,6 +1613,7 @@
             <w:pPr>
               <w:pStyle w:val="Normal"/>
               <w:widowControl/>
+              <w:suppressAutoHyphens w:val="true"/>
               <w:spacing w:lineRule="auto" w:line="240" w:before="0" w:after="0"/>
               <w:jc w:val="left"/>
               <w:rPr>
@@ -1604,6 +1644,7 @@
             <w:pPr>
               <w:pStyle w:val="Normal"/>
               <w:widowControl/>
+              <w:suppressAutoHyphens w:val="true"/>
               <w:spacing w:lineRule="auto" w:line="240" w:before="0" w:after="0"/>
               <w:jc w:val="left"/>
               <w:rPr>
@@ -1634,6 +1675,7 @@
             <w:pPr>
               <w:pStyle w:val="Normal"/>
               <w:widowControl/>
+              <w:suppressAutoHyphens w:val="true"/>
               <w:spacing w:lineRule="auto" w:line="240" w:before="0" w:after="0"/>
               <w:jc w:val="left"/>
               <w:rPr>
@@ -1667,6 +1709,7 @@
             <w:pPr>
               <w:pStyle w:val="Normal"/>
               <w:widowControl/>
+              <w:suppressAutoHyphens w:val="true"/>
               <w:spacing w:lineRule="auto" w:line="240" w:before="0" w:after="0"/>
               <w:jc w:val="left"/>
               <w:rPr>
@@ -1697,6 +1740,7 @@
             <w:pPr>
               <w:pStyle w:val="Normal"/>
               <w:widowControl/>
+              <w:suppressAutoHyphens w:val="true"/>
               <w:spacing w:lineRule="auto" w:line="240" w:before="0" w:after="0"/>
               <w:jc w:val="left"/>
               <w:rPr>
@@ -1727,6 +1771,7 @@
             <w:pPr>
               <w:pStyle w:val="Normal"/>
               <w:widowControl/>
+              <w:suppressAutoHyphens w:val="true"/>
               <w:spacing w:lineRule="auto" w:line="240" w:before="0" w:after="0"/>
               <w:jc w:val="left"/>
               <w:rPr>
@@ -1929,6 +1974,7 @@
             <w:pPr>
               <w:pStyle w:val="Normal"/>
               <w:widowControl/>
+              <w:suppressAutoHyphens w:val="true"/>
               <w:spacing w:lineRule="auto" w:line="240" w:before="0" w:after="0"/>
               <w:jc w:val="left"/>
               <w:rPr>
@@ -1961,6 +2007,7 @@
             <w:pPr>
               <w:pStyle w:val="Normal"/>
               <w:widowControl/>
+              <w:suppressAutoHyphens w:val="true"/>
               <w:spacing w:lineRule="auto" w:line="240" w:before="0" w:after="0"/>
               <w:jc w:val="left"/>
               <w:rPr>
@@ -1995,6 +2042,7 @@
             <w:pPr>
               <w:pStyle w:val="Normal"/>
               <w:widowControl/>
+              <w:suppressAutoHyphens w:val="true"/>
               <w:spacing w:lineRule="auto" w:line="240" w:before="0" w:after="0"/>
               <w:jc w:val="left"/>
               <w:rPr>
@@ -2025,6 +2073,7 @@
             <w:pPr>
               <w:pStyle w:val="Normal"/>
               <w:widowControl/>
+              <w:suppressAutoHyphens w:val="true"/>
               <w:spacing w:lineRule="auto" w:line="240" w:before="0" w:after="0"/>
               <w:jc w:val="left"/>
               <w:rPr>
@@ -2058,6 +2107,7 @@
             <w:pPr>
               <w:pStyle w:val="Normal"/>
               <w:widowControl/>
+              <w:suppressAutoHyphens w:val="true"/>
               <w:spacing w:lineRule="auto" w:line="240" w:before="0" w:after="0"/>
               <w:jc w:val="left"/>
               <w:rPr>
@@ -2088,6 +2138,7 @@
             <w:pPr>
               <w:pStyle w:val="Normal"/>
               <w:widowControl/>
+              <w:suppressAutoHyphens w:val="true"/>
               <w:spacing w:lineRule="auto" w:line="240" w:before="0" w:after="0"/>
               <w:jc w:val="left"/>
               <w:rPr>
@@ -2121,6 +2172,7 @@
             <w:pPr>
               <w:pStyle w:val="Normal"/>
               <w:widowControl/>
+              <w:suppressAutoHyphens w:val="true"/>
               <w:spacing w:lineRule="auto" w:line="240" w:before="0" w:after="0"/>
               <w:jc w:val="left"/>
               <w:rPr>
@@ -2151,6 +2203,7 @@
             <w:pPr>
               <w:pStyle w:val="Normal"/>
               <w:widowControl/>
+              <w:suppressAutoHyphens w:val="true"/>
               <w:spacing w:lineRule="auto" w:line="240" w:before="0" w:after="0"/>
               <w:jc w:val="left"/>
               <w:rPr>
@@ -2184,6 +2237,7 @@
             <w:pPr>
               <w:pStyle w:val="Normal"/>
               <w:widowControl/>
+              <w:suppressAutoHyphens w:val="true"/>
               <w:spacing w:lineRule="auto" w:line="240" w:before="0" w:after="0"/>
               <w:jc w:val="left"/>
               <w:rPr>
@@ -2214,6 +2268,7 @@
             <w:pPr>
               <w:pStyle w:val="Normal"/>
               <w:widowControl/>
+              <w:suppressAutoHyphens w:val="true"/>
               <w:spacing w:lineRule="auto" w:line="240" w:before="0" w:after="0"/>
               <w:jc w:val="left"/>
               <w:rPr>
@@ -2247,6 +2302,7 @@
             <w:pPr>
               <w:pStyle w:val="Normal"/>
               <w:widowControl/>
+              <w:suppressAutoHyphens w:val="true"/>
               <w:spacing w:lineRule="auto" w:line="240" w:before="0" w:after="0"/>
               <w:jc w:val="left"/>
               <w:rPr>
@@ -2277,6 +2333,7 @@
             <w:pPr>
               <w:pStyle w:val="Normal"/>
               <w:widowControl/>
+              <w:suppressAutoHyphens w:val="true"/>
               <w:spacing w:lineRule="auto" w:line="240" w:before="0" w:after="0"/>
               <w:jc w:val="left"/>
               <w:rPr>
@@ -2310,6 +2367,7 @@
             <w:pPr>
               <w:pStyle w:val="Normal"/>
               <w:widowControl/>
+              <w:suppressAutoHyphens w:val="true"/>
               <w:spacing w:lineRule="auto" w:line="240" w:before="0" w:after="0"/>
               <w:jc w:val="left"/>
               <w:rPr>
@@ -2340,6 +2398,7 @@
             <w:pPr>
               <w:pStyle w:val="Normal"/>
               <w:widowControl/>
+              <w:suppressAutoHyphens w:val="true"/>
               <w:spacing w:lineRule="auto" w:line="240" w:before="0" w:after="0"/>
               <w:jc w:val="left"/>
               <w:rPr>
@@ -2373,6 +2432,7 @@
             <w:pPr>
               <w:pStyle w:val="Normal"/>
               <w:widowControl/>
+              <w:suppressAutoHyphens w:val="true"/>
               <w:spacing w:lineRule="auto" w:line="240" w:before="0" w:after="0"/>
               <w:jc w:val="left"/>
               <w:rPr>
@@ -2403,6 +2463,7 @@
             <w:pPr>
               <w:pStyle w:val="Normal"/>
               <w:widowControl/>
+              <w:suppressAutoHyphens w:val="true"/>
               <w:spacing w:lineRule="auto" w:line="240" w:before="0" w:after="0"/>
               <w:jc w:val="left"/>
               <w:rPr>
@@ -2436,6 +2497,7 @@
             <w:pPr>
               <w:pStyle w:val="Normal"/>
               <w:widowControl/>
+              <w:suppressAutoHyphens w:val="true"/>
               <w:spacing w:lineRule="auto" w:line="240" w:before="0" w:after="0"/>
               <w:jc w:val="left"/>
               <w:rPr>
@@ -2466,6 +2528,7 @@
             <w:pPr>
               <w:pStyle w:val="Normal"/>
               <w:widowControl/>
+              <w:suppressAutoHyphens w:val="true"/>
               <w:spacing w:lineRule="auto" w:line="240" w:before="0" w:after="0"/>
               <w:jc w:val="left"/>
               <w:rPr>
@@ -2499,6 +2562,7 @@
             <w:pPr>
               <w:pStyle w:val="Normal"/>
               <w:widowControl/>
+              <w:suppressAutoHyphens w:val="true"/>
               <w:spacing w:lineRule="auto" w:line="240" w:before="0" w:after="0"/>
               <w:jc w:val="left"/>
               <w:rPr>
@@ -2529,6 +2593,7 @@
             <w:pPr>
               <w:pStyle w:val="Normal"/>
               <w:widowControl/>
+              <w:suppressAutoHyphens w:val="true"/>
               <w:spacing w:lineRule="auto" w:line="240" w:before="0" w:after="0"/>
               <w:jc w:val="left"/>
               <w:rPr>
@@ -2562,6 +2627,7 @@
             <w:pPr>
               <w:pStyle w:val="Normal"/>
               <w:widowControl/>
+              <w:suppressAutoHyphens w:val="true"/>
               <w:spacing w:lineRule="auto" w:line="240" w:before="0" w:after="0"/>
               <w:jc w:val="left"/>
               <w:rPr>
@@ -2592,6 +2658,7 @@
             <w:pPr>
               <w:pStyle w:val="Normal"/>
               <w:widowControl/>
+              <w:suppressAutoHyphens w:val="true"/>
               <w:spacing w:lineRule="auto" w:line="240" w:before="0" w:after="0"/>
               <w:jc w:val="left"/>
               <w:rPr>
@@ -2625,6 +2692,7 @@
             <w:pPr>
               <w:pStyle w:val="Normal"/>
               <w:widowControl/>
+              <w:suppressAutoHyphens w:val="true"/>
               <w:spacing w:lineRule="auto" w:line="240" w:before="0" w:after="0"/>
               <w:jc w:val="left"/>
               <w:rPr>
@@ -2655,6 +2723,7 @@
             <w:pPr>
               <w:pStyle w:val="Normal"/>
               <w:widowControl/>
+              <w:suppressAutoHyphens w:val="true"/>
               <w:spacing w:lineRule="auto" w:line="240" w:before="0" w:after="0"/>
               <w:jc w:val="left"/>
               <w:rPr>
@@ -2688,6 +2757,7 @@
             <w:pPr>
               <w:pStyle w:val="Normal"/>
               <w:widowControl/>
+              <w:suppressAutoHyphens w:val="true"/>
               <w:spacing w:lineRule="auto" w:line="240" w:before="0" w:after="0"/>
               <w:jc w:val="left"/>
               <w:rPr>
@@ -2718,6 +2788,7 @@
             <w:pPr>
               <w:pStyle w:val="Normal"/>
               <w:widowControl/>
+              <w:suppressAutoHyphens w:val="true"/>
               <w:spacing w:lineRule="auto" w:line="240" w:before="0" w:after="0"/>
               <w:jc w:val="left"/>
               <w:rPr>
@@ -2751,6 +2822,7 @@
             <w:pPr>
               <w:pStyle w:val="Normal"/>
               <w:widowControl/>
+              <w:suppressAutoHyphens w:val="true"/>
               <w:spacing w:lineRule="auto" w:line="240" w:before="0" w:after="0"/>
               <w:jc w:val="left"/>
               <w:rPr>
@@ -2781,6 +2853,7 @@
             <w:pPr>
               <w:pStyle w:val="Normal"/>
               <w:widowControl/>
+              <w:suppressAutoHyphens w:val="true"/>
               <w:spacing w:lineRule="auto" w:line="240" w:before="0" w:after="0"/>
               <w:jc w:val="left"/>
               <w:rPr>
@@ -3044,6 +3117,7 @@
             <w:pPr>
               <w:pStyle w:val="Normal"/>
               <w:widowControl/>
+              <w:suppressAutoHyphens w:val="true"/>
               <w:spacing w:lineRule="auto" w:line="240" w:before="0" w:after="0"/>
               <w:jc w:val="left"/>
               <w:rPr>
@@ -3076,6 +3150,7 @@
             <w:pPr>
               <w:pStyle w:val="Normal"/>
               <w:widowControl/>
+              <w:suppressAutoHyphens w:val="true"/>
               <w:spacing w:lineRule="auto" w:line="240" w:before="0" w:after="0"/>
               <w:jc w:val="left"/>
               <w:rPr>
@@ -3110,6 +3185,7 @@
             <w:pPr>
               <w:pStyle w:val="Normal"/>
               <w:widowControl/>
+              <w:suppressAutoHyphens w:val="true"/>
               <w:spacing w:lineRule="auto" w:line="240" w:before="0" w:after="0"/>
               <w:jc w:val="left"/>
               <w:rPr>
@@ -3140,6 +3216,7 @@
             <w:pPr>
               <w:pStyle w:val="Normal"/>
               <w:widowControl/>
+              <w:suppressAutoHyphens w:val="true"/>
               <w:spacing w:lineRule="auto" w:line="240" w:before="0" w:after="0"/>
               <w:jc w:val="left"/>
               <w:rPr>
@@ -3173,6 +3250,7 @@
             <w:pPr>
               <w:pStyle w:val="Normal"/>
               <w:widowControl/>
+              <w:suppressAutoHyphens w:val="true"/>
               <w:spacing w:lineRule="auto" w:line="240" w:before="0" w:after="0"/>
               <w:jc w:val="left"/>
               <w:rPr>
@@ -3203,6 +3281,7 @@
             <w:pPr>
               <w:pStyle w:val="Normal"/>
               <w:widowControl/>
+              <w:suppressAutoHyphens w:val="true"/>
               <w:spacing w:lineRule="auto" w:line="240" w:before="0" w:after="0"/>
               <w:jc w:val="left"/>
               <w:rPr>
@@ -3236,6 +3315,7 @@
             <w:pPr>
               <w:pStyle w:val="Normal"/>
               <w:widowControl/>
+              <w:suppressAutoHyphens w:val="true"/>
               <w:spacing w:lineRule="auto" w:line="240" w:before="0" w:after="0"/>
               <w:jc w:val="left"/>
               <w:rPr>
@@ -3266,6 +3346,7 @@
             <w:pPr>
               <w:pStyle w:val="Normal"/>
               <w:widowControl/>
+              <w:suppressAutoHyphens w:val="true"/>
               <w:spacing w:lineRule="auto" w:line="240" w:before="0" w:after="0"/>
               <w:jc w:val="left"/>
               <w:rPr>
@@ -3299,6 +3380,7 @@
             <w:pPr>
               <w:pStyle w:val="Normal"/>
               <w:widowControl/>
+              <w:suppressAutoHyphens w:val="true"/>
               <w:spacing w:lineRule="auto" w:line="240" w:before="0" w:after="0"/>
               <w:jc w:val="left"/>
               <w:rPr>
@@ -3329,6 +3411,7 @@
             <w:pPr>
               <w:pStyle w:val="Normal"/>
               <w:widowControl/>
+              <w:suppressAutoHyphens w:val="true"/>
               <w:spacing w:lineRule="auto" w:line="240" w:before="0" w:after="0"/>
               <w:jc w:val="left"/>
               <w:rPr>
@@ -3362,6 +3445,7 @@
             <w:pPr>
               <w:pStyle w:val="Normal"/>
               <w:widowControl/>
+              <w:suppressAutoHyphens w:val="true"/>
               <w:spacing w:lineRule="auto" w:line="240" w:before="0" w:after="0"/>
               <w:jc w:val="left"/>
               <w:rPr>
@@ -3392,6 +3476,7 @@
             <w:pPr>
               <w:pStyle w:val="Normal"/>
               <w:widowControl/>
+              <w:suppressAutoHyphens w:val="true"/>
               <w:spacing w:lineRule="auto" w:line="240" w:before="0" w:after="0"/>
               <w:jc w:val="left"/>
               <w:rPr>
@@ -3425,6 +3510,7 @@
             <w:pPr>
               <w:pStyle w:val="Normal"/>
               <w:widowControl/>
+              <w:suppressAutoHyphens w:val="true"/>
               <w:spacing w:lineRule="auto" w:line="240" w:before="0" w:after="0"/>
               <w:jc w:val="left"/>
               <w:rPr>
@@ -3455,6 +3541,7 @@
             <w:pPr>
               <w:pStyle w:val="Normal"/>
               <w:widowControl/>
+              <w:suppressAutoHyphens w:val="true"/>
               <w:spacing w:lineRule="auto" w:line="240" w:before="0" w:after="0"/>
               <w:jc w:val="left"/>
               <w:rPr>
@@ -3488,6 +3575,7 @@
             <w:pPr>
               <w:pStyle w:val="Normal"/>
               <w:widowControl/>
+              <w:suppressAutoHyphens w:val="true"/>
               <w:spacing w:lineRule="auto" w:line="240" w:before="0" w:after="0"/>
               <w:jc w:val="left"/>
               <w:rPr>
@@ -3518,6 +3606,7 @@
             <w:pPr>
               <w:pStyle w:val="Normal"/>
               <w:widowControl/>
+              <w:suppressAutoHyphens w:val="true"/>
               <w:spacing w:lineRule="auto" w:line="240" w:before="0" w:after="0"/>
               <w:jc w:val="left"/>
               <w:rPr>
@@ -3551,6 +3640,7 @@
             <w:pPr>
               <w:pStyle w:val="Normal"/>
               <w:widowControl/>
+              <w:suppressAutoHyphens w:val="true"/>
               <w:spacing w:lineRule="auto" w:line="240" w:before="0" w:after="0"/>
               <w:jc w:val="left"/>
               <w:rPr>
@@ -3581,6 +3671,7 @@
             <w:pPr>
               <w:pStyle w:val="Normal"/>
               <w:widowControl/>
+              <w:suppressAutoHyphens w:val="true"/>
               <w:spacing w:lineRule="auto" w:line="240" w:before="0" w:after="0"/>
               <w:jc w:val="left"/>
               <w:rPr>
@@ -3614,6 +3705,7 @@
             <w:pPr>
               <w:pStyle w:val="Normal"/>
               <w:widowControl/>
+              <w:suppressAutoHyphens w:val="true"/>
               <w:spacing w:lineRule="auto" w:line="240" w:before="0" w:after="0"/>
               <w:jc w:val="left"/>
               <w:rPr>
@@ -3644,6 +3736,7 @@
             <w:pPr>
               <w:pStyle w:val="Normal"/>
               <w:widowControl/>
+              <w:suppressAutoHyphens w:val="true"/>
               <w:spacing w:lineRule="auto" w:line="240" w:before="0" w:after="0"/>
               <w:jc w:val="left"/>
               <w:rPr>
@@ -4370,9 +4463,9 @@
       </w:r>
       <w:r>
         <w:rPr>
-          <w:color w:val="454545"/>
+          <w:color w:val="2E7D32"/>
         </w:rPr>
-        <w:t>PLANNED</w:t>
+        <w:t>COMPLETE</w:t>
       </w:r>
     </w:p>
     <w:p>
@@ -4447,6 +4540,36 @@
     </w:p>
     <w:p>
       <w:pPr>
+        <w:pStyle w:val="Heading2"/>
+        <w:keepNext w:val="true"/>
+        <w:spacing w:before="200" w:after="80"/>
+        <w:rPr/>
+      </w:pPr>
+      <w:r>
+        <w:rPr/>
+        <w:t>Phase 8.</w:t>
+      </w:r>
+      <w:r>
+        <w:rPr/>
+        <w:t>5</w:t>
+      </w:r>
+      <w:r>
+        <w:rPr/>
+        <w:t xml:space="preserve"> -  </w:t>
+      </w:r>
+      <w:r>
+        <w:rPr/>
+        <w:t xml:space="preserve">API Tests and Test Database Isolation </w:t>
+      </w:r>
+      <w:r>
+        <w:rPr>
+          <w:color w:val="2E7D32"/>
+        </w:rPr>
+        <w:t>COMPLETE</w:t>
+      </w:r>
+    </w:p>
+    <w:p>
+      <w:pPr>
         <w:pStyle w:val="ListBullet"/>
         <w:numPr>
           <w:ilvl w:val="0"/>
@@ -4456,7 +4579,35 @@
       </w:pPr>
       <w:r>
         <w:rPr/>
-        <w:t>Add first meaningful API/database tests.</w:t>
+        <w:t>Create Marketlens_test database inside of postgre container.</w:t>
+      </w:r>
+    </w:p>
+    <w:p>
+      <w:pPr>
+        <w:pStyle w:val="ListBullet"/>
+        <w:numPr>
+          <w:ilvl w:val="0"/>
+          <w:numId w:val="1"/>
+        </w:numPr>
+        <w:rPr/>
+      </w:pPr>
+      <w:r>
+        <w:rPr/>
+        <w:t>Set up testing engine and sessions that override the database with the test_database.</w:t>
+      </w:r>
+    </w:p>
+    <w:p>
+      <w:pPr>
+        <w:pStyle w:val="ListBullet"/>
+        <w:numPr>
+          <w:ilvl w:val="0"/>
+          <w:numId w:val="1"/>
+        </w:numPr>
+        <w:rPr/>
+      </w:pPr>
+      <w:r>
+        <w:rPr/>
+        <w:t>Set up independent unit tests for all API access points.</w:t>
       </w:r>
     </w:p>
     <w:p>
@@ -5838,6 +5989,7 @@
             <w:pPr>
               <w:pStyle w:val="Normal"/>
               <w:widowControl/>
+              <w:suppressAutoHyphens w:val="true"/>
               <w:spacing w:lineRule="auto" w:line="240" w:before="0" w:after="0"/>
               <w:jc w:val="left"/>
               <w:rPr>
@@ -5870,6 +6022,7 @@
             <w:pPr>
               <w:pStyle w:val="Normal"/>
               <w:widowControl/>
+              <w:suppressAutoHyphens w:val="true"/>
               <w:spacing w:lineRule="auto" w:line="240" w:before="0" w:after="0"/>
               <w:jc w:val="left"/>
               <w:rPr>
@@ -5902,6 +6055,7 @@
             <w:pPr>
               <w:pStyle w:val="Normal"/>
               <w:widowControl/>
+              <w:suppressAutoHyphens w:val="true"/>
               <w:spacing w:lineRule="auto" w:line="240" w:before="0" w:after="0"/>
               <w:jc w:val="left"/>
               <w:rPr>
@@ -5936,6 +6090,7 @@
             <w:pPr>
               <w:pStyle w:val="Normal"/>
               <w:widowControl/>
+              <w:suppressAutoHyphens w:val="true"/>
               <w:spacing w:lineRule="auto" w:line="240" w:before="0" w:after="0"/>
               <w:jc w:val="left"/>
               <w:rPr>
@@ -5966,6 +6121,7 @@
             <w:pPr>
               <w:pStyle w:val="Normal"/>
               <w:widowControl/>
+              <w:suppressAutoHyphens w:val="true"/>
               <w:spacing w:lineRule="auto" w:line="240" w:before="0" w:after="0"/>
               <w:jc w:val="left"/>
               <w:rPr>
@@ -5996,6 +6152,7 @@
             <w:pPr>
               <w:pStyle w:val="Normal"/>
               <w:widowControl/>
+              <w:suppressAutoHyphens w:val="true"/>
               <w:spacing w:lineRule="auto" w:line="240" w:before="0" w:after="0"/>
               <w:jc w:val="left"/>
               <w:rPr>
@@ -6029,6 +6186,7 @@
             <w:pPr>
               <w:pStyle w:val="Normal"/>
               <w:widowControl/>
+              <w:suppressAutoHyphens w:val="true"/>
               <w:spacing w:lineRule="auto" w:line="240" w:before="0" w:after="0"/>
               <w:jc w:val="left"/>
               <w:rPr>
@@ -6059,6 +6217,7 @@
             <w:pPr>
               <w:pStyle w:val="Normal"/>
               <w:widowControl/>
+              <w:suppressAutoHyphens w:val="true"/>
               <w:spacing w:lineRule="auto" w:line="240" w:before="0" w:after="0"/>
               <w:jc w:val="left"/>
               <w:rPr>
@@ -6089,6 +6248,7 @@
             <w:pPr>
               <w:pStyle w:val="Normal"/>
               <w:widowControl/>
+              <w:suppressAutoHyphens w:val="true"/>
               <w:spacing w:lineRule="auto" w:line="240" w:before="0" w:after="0"/>
               <w:jc w:val="left"/>
               <w:rPr>
@@ -6122,6 +6282,7 @@
             <w:pPr>
               <w:pStyle w:val="Normal"/>
               <w:widowControl/>
+              <w:suppressAutoHyphens w:val="true"/>
               <w:spacing w:lineRule="auto" w:line="240" w:before="0" w:after="0"/>
               <w:jc w:val="left"/>
               <w:rPr>
@@ -6152,6 +6313,7 @@
             <w:pPr>
               <w:pStyle w:val="Normal"/>
               <w:widowControl/>
+              <w:suppressAutoHyphens w:val="true"/>
               <w:spacing w:lineRule="auto" w:line="240" w:before="0" w:after="0"/>
               <w:jc w:val="left"/>
               <w:rPr>
@@ -6182,6 +6344,7 @@
             <w:pPr>
               <w:pStyle w:val="Normal"/>
               <w:widowControl/>
+              <w:suppressAutoHyphens w:val="true"/>
               <w:spacing w:lineRule="auto" w:line="240" w:before="0" w:after="0"/>
               <w:jc w:val="left"/>
               <w:rPr>
@@ -6215,6 +6378,7 @@
             <w:pPr>
               <w:pStyle w:val="Normal"/>
               <w:widowControl/>
+              <w:suppressAutoHyphens w:val="true"/>
               <w:spacing w:lineRule="auto" w:line="240" w:before="0" w:after="0"/>
               <w:jc w:val="left"/>
               <w:rPr>
@@ -6245,6 +6409,7 @@
             <w:pPr>
               <w:pStyle w:val="Normal"/>
               <w:widowControl/>
+              <w:suppressAutoHyphens w:val="true"/>
               <w:spacing w:lineRule="auto" w:line="240" w:before="0" w:after="0"/>
               <w:jc w:val="left"/>
               <w:rPr>
@@ -6275,6 +6440,7 @@
             <w:pPr>
               <w:pStyle w:val="Normal"/>
               <w:widowControl/>
+              <w:suppressAutoHyphens w:val="true"/>
               <w:spacing w:lineRule="auto" w:line="240" w:before="0" w:after="0"/>
               <w:jc w:val="left"/>
               <w:rPr>
@@ -6308,6 +6474,7 @@
             <w:pPr>
               <w:pStyle w:val="Normal"/>
               <w:widowControl/>
+              <w:suppressAutoHyphens w:val="true"/>
               <w:spacing w:lineRule="auto" w:line="240" w:before="0" w:after="0"/>
               <w:jc w:val="left"/>
               <w:rPr>
@@ -6338,6 +6505,7 @@
             <w:pPr>
               <w:pStyle w:val="Normal"/>
               <w:widowControl/>
+              <w:suppressAutoHyphens w:val="true"/>
               <w:spacing w:lineRule="auto" w:line="240" w:before="0" w:after="0"/>
               <w:jc w:val="left"/>
               <w:rPr>
@@ -6368,6 +6536,7 @@
             <w:pPr>
               <w:pStyle w:val="Normal"/>
               <w:widowControl/>
+              <w:suppressAutoHyphens w:val="true"/>
               <w:spacing w:lineRule="auto" w:line="240" w:before="0" w:after="0"/>
               <w:jc w:val="left"/>
               <w:rPr>
@@ -6401,6 +6570,7 @@
             <w:pPr>
               <w:pStyle w:val="Normal"/>
               <w:widowControl/>
+              <w:suppressAutoHyphens w:val="true"/>
               <w:spacing w:lineRule="auto" w:line="240" w:before="0" w:after="0"/>
               <w:jc w:val="left"/>
               <w:rPr>
@@ -6431,6 +6601,7 @@
             <w:pPr>
               <w:pStyle w:val="Normal"/>
               <w:widowControl/>
+              <w:suppressAutoHyphens w:val="true"/>
               <w:spacing w:lineRule="auto" w:line="240" w:before="0" w:after="0"/>
               <w:jc w:val="left"/>
               <w:rPr>
@@ -6461,6 +6632,7 @@
             <w:pPr>
               <w:pStyle w:val="Normal"/>
               <w:widowControl/>
+              <w:suppressAutoHyphens w:val="true"/>
               <w:spacing w:lineRule="auto" w:line="240" w:before="0" w:after="0"/>
               <w:jc w:val="left"/>
               <w:rPr>
@@ -6494,6 +6666,7 @@
             <w:pPr>
               <w:pStyle w:val="Normal"/>
               <w:widowControl/>
+              <w:suppressAutoHyphens w:val="true"/>
               <w:spacing w:lineRule="auto" w:line="240" w:before="0" w:after="0"/>
               <w:jc w:val="left"/>
               <w:rPr>
@@ -6524,6 +6697,7 @@
             <w:pPr>
               <w:pStyle w:val="Normal"/>
               <w:widowControl/>
+              <w:suppressAutoHyphens w:val="true"/>
               <w:spacing w:lineRule="auto" w:line="240" w:before="0" w:after="0"/>
               <w:jc w:val="left"/>
               <w:rPr>
@@ -6554,6 +6728,7 @@
             <w:pPr>
               <w:pStyle w:val="Normal"/>
               <w:widowControl/>
+              <w:suppressAutoHyphens w:val="true"/>
               <w:spacing w:lineRule="auto" w:line="240" w:before="0" w:after="0"/>
               <w:jc w:val="left"/>
               <w:rPr>
@@ -6587,6 +6762,7 @@
             <w:pPr>
               <w:pStyle w:val="Normal"/>
               <w:widowControl/>
+              <w:suppressAutoHyphens w:val="true"/>
               <w:spacing w:lineRule="auto" w:line="240" w:before="0" w:after="0"/>
               <w:jc w:val="left"/>
               <w:rPr>
@@ -6617,6 +6793,7 @@
             <w:pPr>
               <w:pStyle w:val="Normal"/>
               <w:widowControl/>
+              <w:suppressAutoHyphens w:val="true"/>
               <w:spacing w:lineRule="auto" w:line="240" w:before="0" w:after="0"/>
               <w:jc w:val="left"/>
               <w:rPr>
@@ -6647,6 +6824,7 @@
             <w:pPr>
               <w:pStyle w:val="Normal"/>
               <w:widowControl/>
+              <w:suppressAutoHyphens w:val="true"/>
               <w:spacing w:lineRule="auto" w:line="240" w:before="0" w:after="0"/>
               <w:jc w:val="left"/>
               <w:rPr>
@@ -6680,6 +6858,7 @@
             <w:pPr>
               <w:pStyle w:val="Normal"/>
               <w:widowControl/>
+              <w:suppressAutoHyphens w:val="true"/>
               <w:spacing w:lineRule="auto" w:line="240" w:before="0" w:after="0"/>
               <w:jc w:val="left"/>
               <w:rPr>
@@ -6710,6 +6889,7 @@
             <w:pPr>
               <w:pStyle w:val="Normal"/>
               <w:widowControl/>
+              <w:suppressAutoHyphens w:val="true"/>
               <w:spacing w:lineRule="auto" w:line="240" w:before="0" w:after="0"/>
               <w:jc w:val="left"/>
               <w:rPr>
@@ -6740,6 +6920,7 @@
             <w:pPr>
               <w:pStyle w:val="Normal"/>
               <w:widowControl/>
+              <w:suppressAutoHyphens w:val="true"/>
               <w:spacing w:lineRule="auto" w:line="240" w:before="0" w:after="0"/>
               <w:jc w:val="left"/>
               <w:rPr>
@@ -6773,6 +6954,7 @@
             <w:pPr>
               <w:pStyle w:val="Normal"/>
               <w:widowControl/>
+              <w:suppressAutoHyphens w:val="true"/>
               <w:spacing w:lineRule="auto" w:line="240" w:before="0" w:after="0"/>
               <w:jc w:val="left"/>
               <w:rPr>
@@ -6803,6 +6985,7 @@
             <w:pPr>
               <w:pStyle w:val="Normal"/>
               <w:widowControl/>
+              <w:suppressAutoHyphens w:val="true"/>
               <w:spacing w:lineRule="auto" w:line="240" w:before="0" w:after="0"/>
               <w:jc w:val="left"/>
               <w:rPr>
@@ -6833,6 +7016,7 @@
             <w:pPr>
               <w:pStyle w:val="Normal"/>
               <w:widowControl/>
+              <w:suppressAutoHyphens w:val="true"/>
               <w:spacing w:lineRule="auto" w:line="240" w:before="0" w:after="0"/>
               <w:jc w:val="left"/>
               <w:rPr>
@@ -6866,6 +7050,7 @@
             <w:pPr>
               <w:pStyle w:val="Normal"/>
               <w:widowControl/>
+              <w:suppressAutoHyphens w:val="true"/>
               <w:spacing w:lineRule="auto" w:line="240" w:before="0" w:after="0"/>
               <w:jc w:val="left"/>
               <w:rPr>
@@ -6896,6 +7081,7 @@
             <w:pPr>
               <w:pStyle w:val="Normal"/>
               <w:widowControl/>
+              <w:suppressAutoHyphens w:val="true"/>
               <w:spacing w:lineRule="auto" w:line="240" w:before="0" w:after="0"/>
               <w:jc w:val="left"/>
               <w:rPr>
@@ -6926,6 +7112,7 @@
             <w:pPr>
               <w:pStyle w:val="Normal"/>
               <w:widowControl/>
+              <w:suppressAutoHyphens w:val="true"/>
               <w:spacing w:lineRule="auto" w:line="240" w:before="0" w:after="0"/>
               <w:jc w:val="left"/>
               <w:rPr>
@@ -6959,6 +7146,7 @@
             <w:pPr>
               <w:pStyle w:val="Normal"/>
               <w:widowControl/>
+              <w:suppressAutoHyphens w:val="true"/>
               <w:spacing w:lineRule="auto" w:line="240" w:before="0" w:after="0"/>
               <w:jc w:val="left"/>
               <w:rPr>
@@ -6989,6 +7177,7 @@
             <w:pPr>
               <w:pStyle w:val="Normal"/>
               <w:widowControl/>
+              <w:suppressAutoHyphens w:val="true"/>
               <w:spacing w:lineRule="auto" w:line="240" w:before="0" w:after="0"/>
               <w:jc w:val="left"/>
               <w:rPr>
@@ -7019,6 +7208,7 @@
             <w:pPr>
               <w:pStyle w:val="Normal"/>
               <w:widowControl/>
+              <w:suppressAutoHyphens w:val="true"/>
               <w:spacing w:lineRule="auto" w:line="240" w:before="0" w:after="0"/>
               <w:jc w:val="left"/>
               <w:rPr>
@@ -7052,6 +7242,7 @@
             <w:pPr>
               <w:pStyle w:val="Normal"/>
               <w:widowControl/>
+              <w:suppressAutoHyphens w:val="true"/>
               <w:spacing w:lineRule="auto" w:line="240" w:before="0" w:after="0"/>
               <w:jc w:val="left"/>
               <w:rPr>
@@ -7082,6 +7273,7 @@
             <w:pPr>
               <w:pStyle w:val="Normal"/>
               <w:widowControl/>
+              <w:suppressAutoHyphens w:val="true"/>
               <w:spacing w:lineRule="auto" w:line="240" w:before="0" w:after="0"/>
               <w:jc w:val="left"/>
               <w:rPr>
@@ -7112,6 +7304,7 @@
             <w:pPr>
               <w:pStyle w:val="Normal"/>
               <w:widowControl/>
+              <w:suppressAutoHyphens w:val="true"/>
               <w:spacing w:lineRule="auto" w:line="240" w:before="0" w:after="0"/>
               <w:jc w:val="left"/>
               <w:rPr>
@@ -7145,6 +7338,7 @@
             <w:pPr>
               <w:pStyle w:val="Normal"/>
               <w:widowControl/>
+              <w:suppressAutoHyphens w:val="true"/>
               <w:spacing w:lineRule="auto" w:line="240" w:before="0" w:after="0"/>
               <w:jc w:val="left"/>
               <w:rPr>
@@ -7175,6 +7369,7 @@
             <w:pPr>
               <w:pStyle w:val="Normal"/>
               <w:widowControl/>
+              <w:suppressAutoHyphens w:val="true"/>
               <w:spacing w:lineRule="auto" w:line="240" w:before="0" w:after="0"/>
               <w:jc w:val="left"/>
               <w:rPr>
@@ -7205,6 +7400,7 @@
             <w:pPr>
               <w:pStyle w:val="Normal"/>
               <w:widowControl/>
+              <w:suppressAutoHyphens w:val="true"/>
               <w:spacing w:lineRule="auto" w:line="240" w:before="0" w:after="0"/>
               <w:jc w:val="left"/>
               <w:rPr>
@@ -7238,6 +7434,7 @@
             <w:pPr>
               <w:pStyle w:val="Normal"/>
               <w:widowControl/>
+              <w:suppressAutoHyphens w:val="true"/>
               <w:spacing w:lineRule="auto" w:line="240" w:before="0" w:after="0"/>
               <w:jc w:val="left"/>
               <w:rPr>
@@ -7268,6 +7465,7 @@
             <w:pPr>
               <w:pStyle w:val="Normal"/>
               <w:widowControl/>
+              <w:suppressAutoHyphens w:val="true"/>
               <w:spacing w:lineRule="auto" w:line="240" w:before="0" w:after="0"/>
               <w:jc w:val="left"/>
               <w:rPr>
@@ -7298,6 +7496,7 @@
             <w:pPr>
               <w:pStyle w:val="Normal"/>
               <w:widowControl/>
+              <w:suppressAutoHyphens w:val="true"/>
               <w:spacing w:lineRule="auto" w:line="240" w:before="0" w:after="0"/>
               <w:jc w:val="left"/>
               <w:rPr>
@@ -7331,6 +7530,7 @@
             <w:pPr>
               <w:pStyle w:val="Normal"/>
               <w:widowControl/>
+              <w:suppressAutoHyphens w:val="true"/>
               <w:spacing w:lineRule="auto" w:line="240" w:before="0" w:after="0"/>
               <w:jc w:val="left"/>
               <w:rPr>
@@ -7361,6 +7561,7 @@
             <w:pPr>
               <w:pStyle w:val="Normal"/>
               <w:widowControl/>
+              <w:suppressAutoHyphens w:val="true"/>
               <w:spacing w:lineRule="auto" w:line="240" w:before="0" w:after="0"/>
               <w:jc w:val="left"/>
               <w:rPr>
@@ -7391,6 +7592,7 @@
             <w:pPr>
               <w:pStyle w:val="Normal"/>
               <w:widowControl/>
+              <w:suppressAutoHyphens w:val="true"/>
               <w:spacing w:lineRule="auto" w:line="240" w:before="0" w:after="0"/>
               <w:jc w:val="left"/>
               <w:rPr>
@@ -7511,6 +7713,7 @@
         </w:tabs>
         <w:ind w:left="1080" w:hanging="360"/>
       </w:pPr>
+      <w:rPr/>
     </w:lvl>
     <w:lvl w:ilvl="2">
       <w:start w:val="1"/>
@@ -7523,6 +7726,7 @@
         </w:tabs>
         <w:ind w:left="1440" w:hanging="360"/>
       </w:pPr>
+      <w:rPr/>
     </w:lvl>
     <w:lvl w:ilvl="3">
       <w:start w:val="1"/>
@@ -7535,6 +7739,7 @@
         </w:tabs>
         <w:ind w:left="1800" w:hanging="360"/>
       </w:pPr>
+      <w:rPr/>
     </w:lvl>
     <w:lvl w:ilvl="4">
       <w:start w:val="1"/>
@@ -7547,6 +7752,7 @@
         </w:tabs>
         <w:ind w:left="2160" w:hanging="360"/>
       </w:pPr>
+      <w:rPr/>
     </w:lvl>
     <w:lvl w:ilvl="5">
       <w:start w:val="1"/>
@@ -7559,6 +7765,7 @@
         </w:tabs>
         <w:ind w:left="2520" w:hanging="360"/>
       </w:pPr>
+      <w:rPr/>
     </w:lvl>
     <w:lvl w:ilvl="6">
       <w:start w:val="1"/>
@@ -7571,6 +7778,7 @@
         </w:tabs>
         <w:ind w:left="2880" w:hanging="360"/>
       </w:pPr>
+      <w:rPr/>
     </w:lvl>
     <w:lvl w:ilvl="7">
       <w:start w:val="1"/>
@@ -7583,6 +7791,7 @@
         </w:tabs>
         <w:ind w:left="3240" w:hanging="360"/>
       </w:pPr>
+      <w:rPr/>
     </w:lvl>
     <w:lvl w:ilvl="8">
       <w:start w:val="1"/>
@@ -7595,6 +7804,7 @@
         </w:tabs>
         <w:ind w:left="3600" w:hanging="360"/>
       </w:pPr>
+      <w:rPr/>
     </w:lvl>
   </w:abstractNum>
   <w:abstractNum w:abstractNumId="2">
@@ -7624,6 +7834,7 @@
         </w:tabs>
         <w:ind w:left="1080" w:hanging="360"/>
       </w:pPr>
+      <w:rPr/>
     </w:lvl>
     <w:lvl w:ilvl="2">
       <w:start w:val="1"/>
@@ -7636,6 +7847,7 @@
         </w:tabs>
         <w:ind w:left="1440" w:hanging="360"/>
       </w:pPr>
+      <w:rPr/>
     </w:lvl>
     <w:lvl w:ilvl="3">
       <w:start w:val="1"/>
@@ -7648,6 +7860,7 @@
         </w:tabs>
         <w:ind w:left="1800" w:hanging="360"/>
       </w:pPr>
+      <w:rPr/>
     </w:lvl>
     <w:lvl w:ilvl="4">
       <w:start w:val="1"/>
@@ -7660,6 +7873,7 @@
         </w:tabs>
         <w:ind w:left="2160" w:hanging="360"/>
       </w:pPr>
+      <w:rPr/>
     </w:lvl>
     <w:lvl w:ilvl="5">
       <w:start w:val="1"/>
@@ -7672,6 +7886,7 @@
         </w:tabs>
         <w:ind w:left="2520" w:hanging="360"/>
       </w:pPr>
+      <w:rPr/>
     </w:lvl>
     <w:lvl w:ilvl="6">
       <w:start w:val="1"/>
@@ -7684,6 +7899,7 @@
         </w:tabs>
         <w:ind w:left="2880" w:hanging="360"/>
       </w:pPr>
+      <w:rPr/>
     </w:lvl>
     <w:lvl w:ilvl="7">
       <w:start w:val="1"/>
@@ -7696,6 +7912,7 @@
         </w:tabs>
         <w:ind w:left="3240" w:hanging="360"/>
       </w:pPr>
+      <w:rPr/>
     </w:lvl>
     <w:lvl w:ilvl="8">
       <w:start w:val="1"/>
@@ -7708,6 +7925,7 @@
         </w:tabs>
         <w:ind w:left="3600" w:hanging="360"/>
       </w:pPr>
+      <w:rPr/>
     </w:lvl>
   </w:abstractNum>
   <w:abstractNum w:abstractNumId="3">
@@ -7737,6 +7955,7 @@
         </w:tabs>
         <w:ind w:left="1080" w:hanging="360"/>
       </w:pPr>
+      <w:rPr/>
     </w:lvl>
     <w:lvl w:ilvl="2">
       <w:start w:val="1"/>
@@ -7749,6 +7968,7 @@
         </w:tabs>
         <w:ind w:left="1440" w:hanging="360"/>
       </w:pPr>
+      <w:rPr/>
     </w:lvl>
     <w:lvl w:ilvl="3">
       <w:start w:val="1"/>
@@ -7761,6 +7981,7 @@
         </w:tabs>
         <w:ind w:left="1800" w:hanging="360"/>
       </w:pPr>
+      <w:rPr/>
     </w:lvl>
     <w:lvl w:ilvl="4">
       <w:start w:val="1"/>
@@ -7773,6 +7994,7 @@
         </w:tabs>
         <w:ind w:left="2160" w:hanging="360"/>
       </w:pPr>
+      <w:rPr/>
     </w:lvl>
     <w:lvl w:ilvl="5">
       <w:start w:val="1"/>
@@ -7785,6 +8007,7 @@
         </w:tabs>
         <w:ind w:left="2520" w:hanging="360"/>
       </w:pPr>
+      <w:rPr/>
     </w:lvl>
     <w:lvl w:ilvl="6">
       <w:start w:val="1"/>
@@ -7797,6 +8020,7 @@
         </w:tabs>
         <w:ind w:left="2880" w:hanging="360"/>
       </w:pPr>
+      <w:rPr/>
     </w:lvl>
     <w:lvl w:ilvl="7">
       <w:start w:val="1"/>
@@ -7809,6 +8033,7 @@
         </w:tabs>
         <w:ind w:left="3240" w:hanging="360"/>
       </w:pPr>
+      <w:rPr/>
     </w:lvl>
     <w:lvl w:ilvl="8">
       <w:start w:val="1"/>
@@ -7821,6 +8046,7 @@
         </w:tabs>
         <w:ind w:left="3600" w:hanging="360"/>
       </w:pPr>
+      <w:rPr/>
     </w:lvl>
   </w:abstractNum>
   <w:abstractNum w:abstractNumId="4">
@@ -7848,6 +8074,7 @@
         </w:tabs>
         <w:ind w:left="1080" w:hanging="360"/>
       </w:pPr>
+      <w:rPr/>
     </w:lvl>
     <w:lvl w:ilvl="2">
       <w:start w:val="1"/>
@@ -7860,6 +8087,7 @@
         </w:tabs>
         <w:ind w:left="1440" w:hanging="360"/>
       </w:pPr>
+      <w:rPr/>
     </w:lvl>
     <w:lvl w:ilvl="3">
       <w:start w:val="1"/>
@@ -7872,6 +8100,7 @@
         </w:tabs>
         <w:ind w:left="1800" w:hanging="360"/>
       </w:pPr>
+      <w:rPr/>
     </w:lvl>
     <w:lvl w:ilvl="4">
       <w:start w:val="1"/>
@@ -7884,6 +8113,7 @@
         </w:tabs>
         <w:ind w:left="2160" w:hanging="360"/>
       </w:pPr>
+      <w:rPr/>
     </w:lvl>
     <w:lvl w:ilvl="5">
       <w:start w:val="1"/>
@@ -7896,6 +8126,7 @@
         </w:tabs>
         <w:ind w:left="2520" w:hanging="360"/>
       </w:pPr>
+      <w:rPr/>
     </w:lvl>
     <w:lvl w:ilvl="6">
       <w:start w:val="1"/>
@@ -7908,6 +8139,7 @@
         </w:tabs>
         <w:ind w:left="2880" w:hanging="360"/>
       </w:pPr>
+      <w:rPr/>
     </w:lvl>
     <w:lvl w:ilvl="7">
       <w:start w:val="1"/>
@@ -7920,6 +8152,7 @@
         </w:tabs>
         <w:ind w:left="3240" w:hanging="360"/>
       </w:pPr>
+      <w:rPr/>
     </w:lvl>
     <w:lvl w:ilvl="8">
       <w:start w:val="1"/>
@@ -7932,6 +8165,7 @@
         </w:tabs>
         <w:ind w:left="3600" w:hanging="360"/>
       </w:pPr>
+      <w:rPr/>
     </w:lvl>
   </w:abstractNum>
   <w:abstractNum w:abstractNumId="5">
@@ -7959,6 +8193,7 @@
         </w:tabs>
         <w:ind w:left="1080" w:hanging="360"/>
       </w:pPr>
+      <w:rPr/>
     </w:lvl>
     <w:lvl w:ilvl="2">
       <w:start w:val="1"/>
@@ -7971,6 +8206,7 @@
         </w:tabs>
         <w:ind w:left="1440" w:hanging="360"/>
       </w:pPr>
+      <w:rPr/>
     </w:lvl>
     <w:lvl w:ilvl="3">
       <w:start w:val="1"/>
@@ -7983,6 +8219,7 @@
         </w:tabs>
         <w:ind w:left="1800" w:hanging="360"/>
       </w:pPr>
+      <w:rPr/>
     </w:lvl>
     <w:lvl w:ilvl="4">
       <w:start w:val="1"/>
@@ -7995,6 +8232,7 @@
         </w:tabs>
         <w:ind w:left="2160" w:hanging="360"/>
       </w:pPr>
+      <w:rPr/>
     </w:lvl>
     <w:lvl w:ilvl="5">
       <w:start w:val="1"/>
@@ -8007,6 +8245,7 @@
         </w:tabs>
         <w:ind w:left="2520" w:hanging="360"/>
       </w:pPr>
+      <w:rPr/>
     </w:lvl>
     <w:lvl w:ilvl="6">
       <w:start w:val="1"/>
@@ -8019,6 +8258,7 @@
         </w:tabs>
         <w:ind w:left="2880" w:hanging="360"/>
       </w:pPr>
+      <w:rPr/>
     </w:lvl>
     <w:lvl w:ilvl="7">
       <w:start w:val="1"/>
@@ -8031,6 +8271,7 @@
         </w:tabs>
         <w:ind w:left="3240" w:hanging="360"/>
       </w:pPr>
+      <w:rPr/>
     </w:lvl>
     <w:lvl w:ilvl="8">
       <w:start w:val="1"/>
@@ -8043,6 +8284,7 @@
         </w:tabs>
         <w:ind w:left="3600" w:hanging="360"/>
       </w:pPr>
+      <w:rPr/>
     </w:lvl>
   </w:abstractNum>
   <w:abstractNum w:abstractNumId="6">
@@ -8070,6 +8312,7 @@
         </w:tabs>
         <w:ind w:left="1080" w:hanging="360"/>
       </w:pPr>
+      <w:rPr/>
     </w:lvl>
     <w:lvl w:ilvl="2">
       <w:start w:val="1"/>
@@ -8082,6 +8325,7 @@
         </w:tabs>
         <w:ind w:left="1440" w:hanging="360"/>
       </w:pPr>
+      <w:rPr/>
     </w:lvl>
     <w:lvl w:ilvl="3">
       <w:start w:val="1"/>
@@ -8094,6 +8338,7 @@
         </w:tabs>
         <w:ind w:left="1800" w:hanging="360"/>
       </w:pPr>
+      <w:rPr/>
     </w:lvl>
     <w:lvl w:ilvl="4">
       <w:start w:val="1"/>
@@ -8106,6 +8351,7 @@
         </w:tabs>
         <w:ind w:left="2160" w:hanging="360"/>
       </w:pPr>
+      <w:rPr/>
     </w:lvl>
     <w:lvl w:ilvl="5">
       <w:start w:val="1"/>
@@ -8118,6 +8364,7 @@
         </w:tabs>
         <w:ind w:left="2520" w:hanging="360"/>
       </w:pPr>
+      <w:rPr/>
     </w:lvl>
     <w:lvl w:ilvl="6">
       <w:start w:val="1"/>
@@ -8130,6 +8377,7 @@
         </w:tabs>
         <w:ind w:left="2880" w:hanging="360"/>
       </w:pPr>
+      <w:rPr/>
     </w:lvl>
     <w:lvl w:ilvl="7">
       <w:start w:val="1"/>
@@ -8142,6 +8390,7 @@
         </w:tabs>
         <w:ind w:left="3240" w:hanging="360"/>
       </w:pPr>
+      <w:rPr/>
     </w:lvl>
     <w:lvl w:ilvl="8">
       <w:start w:val="1"/>
@@ -8154,6 +8403,7 @@
         </w:tabs>
         <w:ind w:left="3600" w:hanging="360"/>
       </w:pPr>
+      <w:rPr/>
     </w:lvl>
   </w:abstractNum>
   <w:abstractNum w:abstractNumId="7">
@@ -8304,7 +8554,7 @@
   <w:docDefaults>
     <w:rPrDefault>
       <w:rPr>
-        <w:rFonts w:ascii="Cambria" w:hAnsi="Cambria" w:eastAsia="ＭＳ 明朝" w:cs="" w:asciiTheme="minorHAnsi" w:cstheme="minorBidi" w:eastAsiaTheme="minorEastAsia" w:hAnsiTheme="minorHAnsi"/>
+        <w:rFonts w:ascii="Cambria" w:hAnsi="Cambria" w:eastAsia="" w:cs="" w:asciiTheme="minorHAnsi" w:cstheme="minorBidi" w:eastAsiaTheme="minorEastAsia" w:hAnsiTheme="minorHAnsi"/>
         <w:sz w:val="22"/>
         <w:szCs w:val="22"/>
         <w:lang w:val="en-US" w:eastAsia="en-US" w:bidi="ar-SA"/>
@@ -8461,12 +8711,13 @@
     <w:rsid w:val="00fc693f"/>
     <w:pPr>
       <w:widowControl/>
+      <w:suppressAutoHyphens w:val="true"/>
       <w:bidi w:val="0"/>
       <w:spacing w:lineRule="auto" w:line="276" w:before="0" w:after="200"/>
       <w:jc w:val="left"/>
     </w:pPr>
     <w:rPr>
-      <w:rFonts w:ascii="Aptos" w:hAnsi="Aptos" w:eastAsia="ＭＳ 明朝" w:cs="" w:cstheme="minorBidi" w:eastAsiaTheme="minorEastAsia"/>
+      <w:rFonts w:ascii="Aptos" w:hAnsi="Aptos" w:eastAsia="" w:cs="" w:cstheme="minorBidi" w:eastAsiaTheme="minorEastAsia"/>
       <w:color w:val="auto"/>
       <w:kern w:val="0"/>
       <w:sz w:val="21"/>
@@ -8489,7 +8740,7 @@
       <w:outlineLvl w:val="0"/>
     </w:pPr>
     <w:rPr>
-      <w:rFonts w:ascii="Calibri" w:hAnsi="Calibri" w:eastAsia="ＭＳ ゴシック" w:cs="" w:asciiTheme="majorHAnsi" w:cstheme="majorBidi" w:eastAsiaTheme="majorEastAsia" w:hAnsiTheme="majorHAnsi"/>
+      <w:rFonts w:ascii="Calibri" w:hAnsi="Calibri" w:eastAsia="" w:cs="" w:asciiTheme="majorHAnsi" w:cstheme="majorBidi" w:eastAsiaTheme="majorEastAsia" w:hAnsiTheme="majorHAnsi"/>
       <w:b/>
       <w:bCs/>
       <w:color w:val="1F4E78"/>
@@ -8513,7 +8764,7 @@
       <w:outlineLvl w:val="1"/>
     </w:pPr>
     <w:rPr>
-      <w:rFonts w:ascii="Calibri" w:hAnsi="Calibri" w:eastAsia="ＭＳ ゴシック" w:cs="" w:asciiTheme="majorHAnsi" w:cstheme="majorBidi" w:eastAsiaTheme="majorEastAsia" w:hAnsiTheme="majorHAnsi"/>
+      <w:rFonts w:ascii="Calibri" w:hAnsi="Calibri" w:eastAsia="" w:cs="" w:asciiTheme="majorHAnsi" w:cstheme="majorBidi" w:eastAsiaTheme="majorEastAsia" w:hAnsiTheme="majorHAnsi"/>
       <w:b/>
       <w:bCs/>
       <w:color w:val="1F4E78"/>
@@ -8537,7 +8788,7 @@
       <w:outlineLvl w:val="2"/>
     </w:pPr>
     <w:rPr>
-      <w:rFonts w:ascii="Calibri" w:hAnsi="Calibri" w:eastAsia="ＭＳ ゴシック" w:cs="" w:asciiTheme="majorHAnsi" w:cstheme="majorBidi" w:eastAsiaTheme="majorEastAsia" w:hAnsiTheme="majorHAnsi"/>
+      <w:rFonts w:ascii="Calibri" w:hAnsi="Calibri" w:eastAsia="" w:cs="" w:asciiTheme="majorHAnsi" w:cstheme="majorBidi" w:eastAsiaTheme="majorEastAsia" w:hAnsiTheme="majorHAnsi"/>
       <w:b/>
       <w:bCs/>
       <w:color w:val="1F4E78"/>
@@ -8561,7 +8812,7 @@
       <w:outlineLvl w:val="3"/>
     </w:pPr>
     <w:rPr>
-      <w:rFonts w:ascii="Calibri" w:hAnsi="Calibri" w:eastAsia="ＭＳ ゴシック" w:cs="" w:asciiTheme="majorHAnsi" w:cstheme="majorBidi" w:eastAsiaTheme="majorEastAsia" w:hAnsiTheme="majorHAnsi"/>
+      <w:rFonts w:ascii="Calibri" w:hAnsi="Calibri" w:eastAsia="" w:cs="" w:asciiTheme="majorHAnsi" w:cstheme="majorBidi" w:eastAsiaTheme="majorEastAsia" w:hAnsiTheme="majorHAnsi"/>
       <w:b/>
       <w:bCs/>
       <w:i/>
@@ -8586,7 +8837,7 @@
       <w:outlineLvl w:val="4"/>
     </w:pPr>
     <w:rPr>
-      <w:rFonts w:ascii="Calibri" w:hAnsi="Calibri" w:eastAsia="ＭＳ ゴシック" w:cs="" w:asciiTheme="majorHAnsi" w:cstheme="majorBidi" w:eastAsiaTheme="majorEastAsia" w:hAnsiTheme="majorHAnsi"/>
+      <w:rFonts w:ascii="Calibri" w:hAnsi="Calibri" w:eastAsia="" w:cs="" w:asciiTheme="majorHAnsi" w:cstheme="majorBidi" w:eastAsiaTheme="majorEastAsia" w:hAnsiTheme="majorHAnsi"/>
       <w:color w:themeColor="accent1" w:themeShade="7f" w:val="243F60"/>
     </w:rPr>
   </w:style>
@@ -8607,7 +8858,7 @@
       <w:outlineLvl w:val="5"/>
     </w:pPr>
     <w:rPr>
-      <w:rFonts w:ascii="Calibri" w:hAnsi="Calibri" w:eastAsia="ＭＳ ゴシック" w:cs="" w:asciiTheme="majorHAnsi" w:cstheme="majorBidi" w:eastAsiaTheme="majorEastAsia" w:hAnsiTheme="majorHAnsi"/>
+      <w:rFonts w:ascii="Calibri" w:hAnsi="Calibri" w:eastAsia="" w:cs="" w:asciiTheme="majorHAnsi" w:cstheme="majorBidi" w:eastAsiaTheme="majorEastAsia" w:hAnsiTheme="majorHAnsi"/>
       <w:i/>
       <w:iCs/>
       <w:color w:themeColor="accent1" w:themeShade="7f" w:val="243F60"/>
@@ -8630,7 +8881,7 @@
       <w:outlineLvl w:val="6"/>
     </w:pPr>
     <w:rPr>
-      <w:rFonts w:ascii="Calibri" w:hAnsi="Calibri" w:eastAsia="ＭＳ ゴシック" w:cs="" w:asciiTheme="majorHAnsi" w:cstheme="majorBidi" w:eastAsiaTheme="majorEastAsia" w:hAnsiTheme="majorHAnsi"/>
+      <w:rFonts w:ascii="Calibri" w:hAnsi="Calibri" w:eastAsia="" w:cs="" w:asciiTheme="majorHAnsi" w:cstheme="majorBidi" w:eastAsiaTheme="majorEastAsia" w:hAnsiTheme="majorHAnsi"/>
       <w:i/>
       <w:iCs/>
       <w:color w:themeColor="text1" w:themeTint="bf" w:val="404040"/>
@@ -8653,7 +8904,7 @@
       <w:outlineLvl w:val="7"/>
     </w:pPr>
     <w:rPr>
-      <w:rFonts w:ascii="Calibri" w:hAnsi="Calibri" w:eastAsia="ＭＳ ゴシック" w:cs="" w:asciiTheme="majorHAnsi" w:cstheme="majorBidi" w:eastAsiaTheme="majorEastAsia" w:hAnsiTheme="majorHAnsi"/>
+      <w:rFonts w:ascii="Calibri" w:hAnsi="Calibri" w:eastAsia="" w:cs="" w:asciiTheme="majorHAnsi" w:cstheme="majorBidi" w:eastAsiaTheme="majorEastAsia" w:hAnsiTheme="majorHAnsi"/>
       <w:color w:themeColor="accent1" w:val="4F81BD"/>
       <w:sz w:val="20"/>
       <w:szCs w:val="20"/>
@@ -8676,7 +8927,7 @@
       <w:outlineLvl w:val="8"/>
     </w:pPr>
     <w:rPr>
-      <w:rFonts w:ascii="Calibri" w:hAnsi="Calibri" w:eastAsia="ＭＳ ゴシック" w:cs="" w:asciiTheme="majorHAnsi" w:cstheme="majorBidi" w:eastAsiaTheme="majorEastAsia" w:hAnsiTheme="majorHAnsi"/>
+      <w:rFonts w:ascii="Calibri" w:hAnsi="Calibri" w:eastAsia="" w:cs="" w:asciiTheme="majorHAnsi" w:cstheme="majorBidi" w:eastAsiaTheme="majorEastAsia" w:hAnsiTheme="majorHAnsi"/>
       <w:i/>
       <w:iCs/>
       <w:color w:themeColor="text1" w:themeTint="bf" w:val="404040"/>
@@ -8718,7 +8969,7 @@
     <w:qFormat/>
     <w:rsid w:val="00fc693f"/>
     <w:rPr>
-      <w:rFonts w:ascii="Calibri" w:hAnsi="Calibri" w:eastAsia="ＭＳ ゴシック" w:cs="" w:asciiTheme="majorHAnsi" w:cstheme="majorBidi" w:eastAsiaTheme="majorEastAsia" w:hAnsiTheme="majorHAnsi"/>
+      <w:rFonts w:ascii="Calibri" w:hAnsi="Calibri" w:eastAsia="" w:cs="" w:asciiTheme="majorHAnsi" w:cstheme="majorBidi" w:eastAsiaTheme="majorEastAsia" w:hAnsiTheme="majorHAnsi"/>
       <w:b/>
       <w:bCs/>
       <w:color w:themeColor="accent1" w:themeShade="bf" w:val="365F91"/>
@@ -8734,7 +8985,7 @@
     <w:qFormat/>
     <w:rsid w:val="00fc693f"/>
     <w:rPr>
-      <w:rFonts w:ascii="Calibri" w:hAnsi="Calibri" w:eastAsia="ＭＳ ゴシック" w:cs="" w:asciiTheme="majorHAnsi" w:cstheme="majorBidi" w:eastAsiaTheme="majorEastAsia" w:hAnsiTheme="majorHAnsi"/>
+      <w:rFonts w:ascii="Calibri" w:hAnsi="Calibri" w:eastAsia="" w:cs="" w:asciiTheme="majorHAnsi" w:cstheme="majorBidi" w:eastAsiaTheme="majorEastAsia" w:hAnsiTheme="majorHAnsi"/>
       <w:b/>
       <w:bCs/>
       <w:color w:themeColor="accent1" w:val="4F81BD"/>
@@ -8750,7 +9001,7 @@
     <w:qFormat/>
     <w:rsid w:val="00fc693f"/>
     <w:rPr>
-      <w:rFonts w:ascii="Calibri" w:hAnsi="Calibri" w:eastAsia="ＭＳ ゴシック" w:cs="" w:asciiTheme="majorHAnsi" w:cstheme="majorBidi" w:eastAsiaTheme="majorEastAsia" w:hAnsiTheme="majorHAnsi"/>
+      <w:rFonts w:ascii="Calibri" w:hAnsi="Calibri" w:eastAsia="" w:cs="" w:asciiTheme="majorHAnsi" w:cstheme="majorBidi" w:eastAsiaTheme="majorEastAsia" w:hAnsiTheme="majorHAnsi"/>
       <w:b/>
       <w:bCs/>
       <w:color w:themeColor="accent1" w:val="4F81BD"/>
@@ -8764,7 +9015,7 @@
     <w:qFormat/>
     <w:rsid w:val="00fc693f"/>
     <w:rPr>
-      <w:rFonts w:ascii="Calibri" w:hAnsi="Calibri" w:eastAsia="ＭＳ ゴシック" w:cs="" w:asciiTheme="majorHAnsi" w:cstheme="majorBidi" w:eastAsiaTheme="majorEastAsia" w:hAnsiTheme="majorHAnsi"/>
+      <w:rFonts w:ascii="Calibri" w:hAnsi="Calibri" w:eastAsia="" w:cs="" w:asciiTheme="majorHAnsi" w:cstheme="majorBidi" w:eastAsiaTheme="majorEastAsia" w:hAnsiTheme="majorHAnsi"/>
       <w:color w:themeColor="text2" w:themeShade="bf" w:val="17365D"/>
       <w:spacing w:val="5"/>
       <w:kern w:val="2"/>
@@ -8780,7 +9031,7 @@
     <w:qFormat/>
     <w:rsid w:val="00fc693f"/>
     <w:rPr>
-      <w:rFonts w:ascii="Calibri" w:hAnsi="Calibri" w:eastAsia="ＭＳ ゴシック" w:cs="" w:asciiTheme="majorHAnsi" w:cstheme="majorBidi" w:eastAsiaTheme="majorEastAsia" w:hAnsiTheme="majorHAnsi"/>
+      <w:rFonts w:ascii="Calibri" w:hAnsi="Calibri" w:eastAsia="" w:cs="" w:asciiTheme="majorHAnsi" w:cstheme="majorBidi" w:eastAsiaTheme="majorEastAsia" w:hAnsiTheme="majorHAnsi"/>
       <w:i/>
       <w:iCs/>
       <w:color w:themeColor="accent1" w:val="4F81BD"/>
@@ -8853,7 +9104,7 @@
     <w:qFormat/>
     <w:rsid w:val="00fc693f"/>
     <w:rPr>
-      <w:rFonts w:ascii="Calibri" w:hAnsi="Calibri" w:eastAsia="ＭＳ ゴシック" w:cs="" w:asciiTheme="majorHAnsi" w:cstheme="majorBidi" w:eastAsiaTheme="majorEastAsia" w:hAnsiTheme="majorHAnsi"/>
+      <w:rFonts w:ascii="Calibri" w:hAnsi="Calibri" w:eastAsia="" w:cs="" w:asciiTheme="majorHAnsi" w:cstheme="majorBidi" w:eastAsiaTheme="majorEastAsia" w:hAnsiTheme="majorHAnsi"/>
       <w:b/>
       <w:bCs/>
       <w:i/>
@@ -8870,7 +9121,7 @@
     <w:qFormat/>
     <w:rsid w:val="00fc693f"/>
     <w:rPr>
-      <w:rFonts w:ascii="Calibri" w:hAnsi="Calibri" w:eastAsia="ＭＳ ゴシック" w:cs="" w:asciiTheme="majorHAnsi" w:cstheme="majorBidi" w:eastAsiaTheme="majorEastAsia" w:hAnsiTheme="majorHAnsi"/>
+      <w:rFonts w:ascii="Calibri" w:hAnsi="Calibri" w:eastAsia="" w:cs="" w:asciiTheme="majorHAnsi" w:cstheme="majorBidi" w:eastAsiaTheme="majorEastAsia" w:hAnsiTheme="majorHAnsi"/>
       <w:color w:themeColor="accent1" w:themeShade="7f" w:val="243F60"/>
     </w:rPr>
   </w:style>
@@ -8883,7 +9134,7 @@
     <w:qFormat/>
     <w:rsid w:val="00fc693f"/>
     <w:rPr>
-      <w:rFonts w:ascii="Calibri" w:hAnsi="Calibri" w:eastAsia="ＭＳ ゴシック" w:cs="" w:asciiTheme="majorHAnsi" w:cstheme="majorBidi" w:eastAsiaTheme="majorEastAsia" w:hAnsiTheme="majorHAnsi"/>
+      <w:rFonts w:ascii="Calibri" w:hAnsi="Calibri" w:eastAsia="" w:cs="" w:asciiTheme="majorHAnsi" w:cstheme="majorBidi" w:eastAsiaTheme="majorEastAsia" w:hAnsiTheme="majorHAnsi"/>
       <w:i/>
       <w:iCs/>
       <w:color w:themeColor="accent1" w:themeShade="7f" w:val="243F60"/>
@@ -8898,7 +9149,7 @@
     <w:qFormat/>
     <w:rsid w:val="00fc693f"/>
     <w:rPr>
-      <w:rFonts w:ascii="Calibri" w:hAnsi="Calibri" w:eastAsia="ＭＳ ゴシック" w:cs="" w:asciiTheme="majorHAnsi" w:cstheme="majorBidi" w:eastAsiaTheme="majorEastAsia" w:hAnsiTheme="majorHAnsi"/>
+      <w:rFonts w:ascii="Calibri" w:hAnsi="Calibri" w:eastAsia="" w:cs="" w:asciiTheme="majorHAnsi" w:cstheme="majorBidi" w:eastAsiaTheme="majorEastAsia" w:hAnsiTheme="majorHAnsi"/>
       <w:i/>
       <w:iCs/>
       <w:color w:themeColor="text1" w:themeTint="bf" w:val="404040"/>
@@ -8913,7 +9164,7 @@
     <w:qFormat/>
     <w:rsid w:val="00fc693f"/>
     <w:rPr>
-      <w:rFonts w:ascii="Calibri" w:hAnsi="Calibri" w:eastAsia="ＭＳ ゴシック" w:cs="" w:asciiTheme="majorHAnsi" w:cstheme="majorBidi" w:eastAsiaTheme="majorEastAsia" w:hAnsiTheme="majorHAnsi"/>
+      <w:rFonts w:ascii="Calibri" w:hAnsi="Calibri" w:eastAsia="" w:cs="" w:asciiTheme="majorHAnsi" w:cstheme="majorBidi" w:eastAsiaTheme="majorEastAsia" w:hAnsiTheme="majorHAnsi"/>
       <w:color w:themeColor="accent1" w:val="4F81BD"/>
       <w:sz w:val="20"/>
       <w:szCs w:val="20"/>
@@ -8928,7 +9179,7 @@
     <w:qFormat/>
     <w:rsid w:val="00fc693f"/>
     <w:rPr>
-      <w:rFonts w:ascii="Calibri" w:hAnsi="Calibri" w:eastAsia="ＭＳ ゴシック" w:cs="" w:asciiTheme="majorHAnsi" w:cstheme="majorBidi" w:eastAsiaTheme="majorEastAsia" w:hAnsiTheme="majorHAnsi"/>
+      <w:rFonts w:ascii="Calibri" w:hAnsi="Calibri" w:eastAsia="" w:cs="" w:asciiTheme="majorHAnsi" w:cstheme="majorBidi" w:eastAsiaTheme="majorEastAsia" w:hAnsiTheme="majorHAnsi"/>
       <w:i/>
       <w:iCs/>
       <w:color w:themeColor="text1" w:themeTint="bf" w:val="404040"/>
@@ -9158,12 +9409,13 @@
     <w:rsid w:val="00fc693f"/>
     <w:pPr>
       <w:widowControl/>
+      <w:suppressAutoHyphens w:val="true"/>
       <w:bidi w:val="0"/>
       <w:spacing w:lineRule="auto" w:line="240" w:before="0" w:after="0"/>
       <w:jc w:val="left"/>
     </w:pPr>
     <w:rPr>
-      <w:rFonts w:ascii="Cambria" w:hAnsi="Cambria" w:eastAsia="ＭＳ 明朝" w:cs="" w:asciiTheme="minorHAnsi" w:cstheme="minorBidi" w:eastAsiaTheme="minorEastAsia" w:hAnsiTheme="minorHAnsi"/>
+      <w:rFonts w:ascii="Cambria" w:hAnsi="Cambria" w:eastAsia="" w:cs="" w:asciiTheme="minorHAnsi" w:cstheme="minorBidi" w:eastAsiaTheme="minorEastAsia" w:hAnsiTheme="minorHAnsi"/>
       <w:color w:val="auto"/>
       <w:kern w:val="0"/>
       <w:sz w:val="22"/>
@@ -9187,7 +9439,7 @@
       <w:contextualSpacing/>
     </w:pPr>
     <w:rPr>
-      <w:rFonts w:ascii="Calibri" w:hAnsi="Calibri" w:eastAsia="ＭＳ ゴシック" w:cs="" w:asciiTheme="majorHAnsi" w:cstheme="majorBidi" w:eastAsiaTheme="majorEastAsia" w:hAnsiTheme="majorHAnsi"/>
+      <w:rFonts w:ascii="Calibri" w:hAnsi="Calibri" w:eastAsia="" w:cs="" w:asciiTheme="majorHAnsi" w:cstheme="majorBidi" w:eastAsiaTheme="majorEastAsia" w:hAnsiTheme="majorHAnsi"/>
       <w:b/>
       <w:color w:val="1F4E78"/>
       <w:spacing w:val="5"/>
@@ -9206,7 +9458,7 @@
     <w:rsid w:val="00fc693f"/>
     <w:pPr/>
     <w:rPr>
-      <w:rFonts w:ascii="Calibri" w:hAnsi="Calibri" w:eastAsia="ＭＳ ゴシック" w:cs="" w:asciiTheme="majorHAnsi" w:cstheme="majorBidi" w:eastAsiaTheme="majorEastAsia" w:hAnsiTheme="majorHAnsi"/>
+      <w:rFonts w:ascii="Calibri" w:hAnsi="Calibri" w:eastAsia="" w:cs="" w:asciiTheme="majorHAnsi" w:cstheme="majorBidi" w:eastAsiaTheme="majorEastAsia" w:hAnsiTheme="majorHAnsi"/>
       <w:i/>
       <w:iCs/>
       <w:color w:themeColor="accent1" w:val="4F81BD"/>
@@ -9439,12 +9691,13 @@
         <w:tab w:val="left" w:pos="3456" w:leader="none"/>
         <w:tab w:val="left" w:pos="4032" w:leader="none"/>
       </w:tabs>
+      <w:suppressAutoHyphens w:val="true"/>
       <w:bidi w:val="0"/>
       <w:spacing w:lineRule="auto" w:line="276" w:before="0" w:after="200"/>
       <w:jc w:val="left"/>
     </w:pPr>
     <w:rPr>
-      <w:rFonts w:ascii="Courier" w:hAnsi="Courier" w:eastAsia="ＭＳ 明朝" w:cs="" w:cstheme="minorBidi" w:eastAsiaTheme="minorEastAsia"/>
+      <w:rFonts w:ascii="Courier" w:hAnsi="Courier" w:eastAsia="" w:cs="" w:cstheme="minorBidi" w:eastAsiaTheme="minorEastAsia"/>
       <w:color w:val="auto"/>
       <w:kern w:val="0"/>
       <w:sz w:val="20"/>
@@ -12642,7 +12895,6 @@
       <w:pPr>
         <w:spacing w:before="0" w:after="0" w:line="240" w:lineRule="auto"/>
       </w:pPr>
-      <w:rPr/>
       <w:tblPr/>
       <w:tcPr>
         <w:tcBorders>
@@ -12788,7 +13040,6 @@
       <w:pPr>
         <w:spacing w:before="0" w:after="0" w:line="240" w:lineRule="auto"/>
       </w:pPr>
-      <w:rPr/>
       <w:tblPr/>
       <w:tcPr>
         <w:tcBorders>
@@ -12934,7 +13185,6 @@
       <w:pPr>
         <w:spacing w:before="0" w:after="0" w:line="240" w:lineRule="auto"/>
       </w:pPr>
-      <w:rPr/>
       <w:tblPr/>
       <w:tcPr>
         <w:tcBorders>
@@ -13080,7 +13330,6 @@
       <w:pPr>
         <w:spacing w:before="0" w:after="0" w:line="240" w:lineRule="auto"/>
       </w:pPr>
-      <w:rPr/>
       <w:tblPr/>
       <w:tcPr>
         <w:tcBorders>
@@ -13226,7 +13475,6 @@
       <w:pPr>
         <w:spacing w:before="0" w:after="0" w:line="240" w:lineRule="auto"/>
       </w:pPr>
-      <w:rPr/>
       <w:tblPr/>
       <w:tcPr>
         <w:tcBorders>
@@ -13372,7 +13620,6 @@
       <w:pPr>
         <w:spacing w:before="0" w:after="0" w:line="240" w:lineRule="auto"/>
       </w:pPr>
-      <w:rPr/>
       <w:tblPr/>
       <w:tcPr>
         <w:tcBorders>
@@ -13518,7 +13765,6 @@
       <w:pPr>
         <w:spacing w:before="0" w:after="0" w:line="240" w:lineRule="auto"/>
       </w:pPr>
-      <w:rPr/>
       <w:tblPr/>
       <w:tcPr>
         <w:tcBorders>

</xml_diff>

<commit_message>
created ingestion api and ingestion api unit tests
</commit_message>
<xml_diff>
--- a/MarketLens_Project_Requirements_and_Implementation_Plan_v1.1.docx
+++ b/MarketLens_Project_Requirements_and_Implementation_Plan_v1.1.docx
@@ -4547,19 +4547,7 @@
       </w:pPr>
       <w:r>
         <w:rPr/>
-        <w:t>Phase 8.</w:t>
-      </w:r>
-      <w:r>
-        <w:rPr/>
-        <w:t>5</w:t>
-      </w:r>
-      <w:r>
-        <w:rPr/>
-        <w:t xml:space="preserve"> -  </w:t>
-      </w:r>
-      <w:r>
-        <w:rPr/>
-        <w:t xml:space="preserve">API Tests and Test Database Isolation </w:t>
+        <w:t xml:space="preserve">Phase 8.5 -  API Tests and Test Database Isolation </w:t>
       </w:r>
       <w:r>
         <w:rPr>
@@ -4623,9 +4611,9 @@
       </w:r>
       <w:r>
         <w:rPr>
-          <w:color w:val="454545"/>
+          <w:color w:val="2E7D32"/>
         </w:rPr>
-        <w:t>PLANNED</w:t>
+        <w:t>COMPLETE</w:t>
       </w:r>
     </w:p>
     <w:p>
@@ -4727,7 +4715,7 @@
         <w:rPr>
           <w:color w:val="454545"/>
         </w:rPr>
-        <w:t>PLANNED</w:t>
+        <w:t>In Progress</w:t>
       </w:r>
     </w:p>
     <w:p>

</xml_diff>